<commit_message>
docs: add GitHub repository link to report
</commit_message>
<xml_diff>
--- a/report/5G用户预测实验报告.docx
+++ b/report/5G用户预测实验报告.docx
@@ -362,6 +362,26 @@
         <w:t>本项目完成了数据读取、特征处理、两种算法建模、AUC 评估、图表展示和结果分析，满足课程作业对源码、Notebook 和报告的基本要求。</w:t>
       </w:r>
     </w:p>
+    <w:p>
+      <w:pPr>
+        <w:pStyle w:val="Heading1"/>
+      </w:pPr>
+      <w:r>
+        <w:t>八、项目开源地址</w:t>
+      </w:r>
+    </w:p>
+    <w:p>
+      <w:r>
+        <w:t>本项目已上传至 GitHub 开源仓库：</w:t>
+      </w:r>
+      <w:r>
+        <w:rPr>
+          <w:color w:val="0563C1"/>
+          <w:u w:val="single"/>
+        </w:rPr>
+        <w:t>https://github.com/haohao-u/5g-user-prediction</w:t>
+      </w:r>
+    </w:p>
     <w:sectPr>
       <w:pgSz w:w="12240" w:h="15840"/>
       <w:pgMar w:top="1440" w:right="1440" w:bottom="1440" w:left="1440" w:header="720" w:footer="720" w:gutter="0"/>

</xml_diff>